<commit_message>
feat: complete TV5 verification and group submission package
</commit_message>
<xml_diff>
--- a/Bo_nop_Nhom06/report/Nhom_06_Bao_Cao_Cuoi_Ky_DBMS330284.docx
+++ b/Bo_nop_Nhom06/report/Nhom_06_Bao_Cao_Cuoi_Ky_DBMS330284.docx
@@ -658,7 +658,7 @@
     </w:p>
     <w:p>
       <w:r>
-        <w:t>Phiên bản báo cáo ngày 10/10/2026 phản ánh source tích hợp trên main tại commit 0223f2f sau PR 38. Kết quả thực nghiệm được ghi theo ngày và môi trường của từng lần chạy. Các số đo trên fixture kiểm thử không được xem là bảo đảm hiệu năng cho mọi dữ liệu hoặc máy chạy.</w:t>
+        <w:t>Bản cập nhật ngày 13/10/2026 đối chiếu checkout a7e1096 cùng các sửa local tiền, tuổi và validation đã kiểm; chưa commit. Đã nhận riêng evidence TV2 từ PR44 head7efd9dd, không nhận PR đã merge. Kết quả giữ đúng ngày, môi trường và fixture từng lượt; không suy rộng hiệu năng toàn ứng dụng.</w:t>
       </w:r>
     </w:p>
     <w:tbl>
@@ -1070,7 +1070,7 @@
               <w:rPr>
                 <w:sz w:val="21"/>
               </w:rPr>
-              <w:t>09/10/2026 trên database QA riêng</w:t>
+              <w:t>13/10/2026: handler Swing tự động, SQL QA riêng</w:t>
             </w:r>
           </w:p>
         </w:tc>
@@ -16741,7 +16741,7 @@
     </w:p>
     <w:p>
       <w:r>
-        <w:t>Validation Java kiểm tra nhiều điều kiện trước JDBC; SQL có CHECK và UNIQUE để bảo vệ cả đường ghi ngoài ứng dụng. CHECK tuổi dùng DATEDIFF(YEAR, NgaySinh, NgayVaoLam) ≥18, đếm ranh giới năm nên không phải kiểm tra tuổi theo ngày sinh chính xác. Đây là giới hạn của biểu thức hiện hành cần được hiểu khi chọn dữ liệu kiểm thử.</w:t>
+        <w:t>Validation Java kiểm tra dữ liệu trước JDBC; SQL có CHECK và UNIQUE bảo vệ cả đường ghi ngoài ứng dụng. Ngày 13/10, CHECK tuổi của schema tạo mới sửa thành NgaySinh &lt;= DATEADD(YEAR,-18,NgayVaoLam), thay DATEDIFF đếm ranh giới năm. Chín ca, 18 thao tác kiểm sinh nhật và 29/2 đã PASS; database đang tồn tại chưa tự được migration constraint này.</w:t>
       </w:r>
     </w:p>
     <w:p>
@@ -21898,7 +21898,7 @@
     </w:p>
     <w:p>
       <w:r>
-        <w:t>Một CHECK không tự kiểm chứng mọi ý nghĩa nghiệp vụ. Ví dụ CHECK email SQL là biểu thức LIKE đơn giản; validator Java kiểm tra thêm cấu trúc. CHECK tuổi dựa DATEDIFF YEAR có giới hạn ranh giới năm. Trạng thái kỳ cần đọc bảng khác nên được trigger xử lý, không cố đưa toàn bộ quy tắc vào CHECK một dòng.</w:t>
+        <w:t>CHECK email SQL dùng LIKE đơn giản; validator Java kiểm thêm cấu trúc. CHECK tuổi ở schema mới kiểm đủ 18 tuổi theo ngày; ca 29/2 phải đến 1/3 trong năm không nhuận. Database cũ cần migration riêng. Trạng thái kỳ đọc bảng khác được trigger xử lý, không đưa mọi quy tắc vào CHECK.</w:t>
       </w:r>
     </w:p>
     <w:p>
@@ -25547,7 +25547,7 @@
               <w:rPr>
                 <w:sz w:val="21"/>
               </w:rPr>
-              <w:t>ISNULL(TienCong,0) + ISNULL(PhuCap,0) − ISNULL(KhauTru,0); trả DECIMAL(15,2)</w:t>
+              <w:t>ISNULL(TienCong,0) + ISNULL(PhuCap,0) − ISNULL(KhauTru,0); trả DECIMAL(18,2)</w:t>
             </w:r>
           </w:p>
         </w:tc>
@@ -25590,7 +25590,7 @@
     </w:p>
     <w:p>
       <w:r>
-        <w:t>Kiểu tiền dùng DECIMAL để biểu diễn số thập phân có thang cố định. Các miền giá trị của function và bảng không phải hoàn toàn đồng nhất: function thực nhận DECIMAL(15,2) trong khi cột chi tiết DECIMAL(18,2). Không coi dữ liệu cực lớn là đã kiểm thử chỉ vì kiểu cột có khả năng chứa; cần có ca biên trước khi mở rộng quy mô số tiền.</w:t>
+        <w:t>Kiểu tiền của fn_TinhThucNhan và cột chi tiết thống nhất DECIMAL(18,2). QA 13/10/2026 PASS 9 ca NULL/0/âm/thập phân/biên lớn và tổng trung gian lớn, cùng 3 ca tràn đầu vào/đầu ra báo lỗi 8115. Luồng tính lương lưu được giá trị lớn; khi tràn, rollback giữ nguyên toàn bộ header/chi tiết và trạng thái nháp. Minh chứng: TV5_Money.messages.log, lượt QA 20261013_145645_6808c29e. Kết quả chỉ áp dụng các ca đã kiểm, không thay cho mọi miền dữ liệu.</w:t>
       </w:r>
     </w:p>
     <w:p>
@@ -37211,7 +37211,7 @@
     </w:p>
     <w:p>
       <w:r>
-        <w:t>Ba kiểm tra lại sau sửa và SQL đối chiếu xác nhận các lỗi tương ứng đã được xử lý. Chưa kiểm GUI Admin, CRUD phòng/chức vụ, thêm/xóa nhân viên, xóa khoản/kỳ, batch, mất SQL thật, nhiều phiên GUI hoặc mọi DPI. Những phạm vi này được giữ trong phần đánh giá, không ẩn sau tổng assertions.</w:t>
+        <w:t>Ba kiểm tra lại ngày 09/10 đã xác nhận các lỗi tương ứng được xử lý. Bổ sung ngày 13/10 trên QA riêng kiểm GUI quản trị login ở cả thiếu/đủ quyền server, ngắt kết nối relay thật khi đọc/ghi và đối chiếu SQL trước thử lại, request cũ khi đổi kỳ/phiên, cùng layout Swing scale 1/1,25/1,5. Đây là kiểm tự động handler Swing và ảnh render; không thay kiểm DPI Windows bằng tay, mọi phiên GUI đồng thời hoặc cài trên máy khác.</w:t>
       </w:r>
     </w:p>
     <w:p>
@@ -37538,7 +37538,7 @@
               <w:rPr>
                 <w:sz w:val="21"/>
               </w:rPr>
-              <w:t>Số 574 →5 trong tài liệu cũ</w:t>
+              <w:t>30.000 dòng tạm; 13/10/2026; 273/9 dòng</w:t>
             </w:r>
           </w:p>
         </w:tc>
@@ -37563,7 +37563,7 @@
               <w:rPr>
                 <w:sz w:val="21"/>
               </w:rPr>
-              <w:t>Lịch sử</w:t>
+              <w:t>Messages 574 →5; XML 522 →5</w:t>
             </w:r>
           </w:p>
         </w:tc>
@@ -37588,7 +37588,7 @@
               <w:rPr>
                 <w:sz w:val="21"/>
               </w:rPr>
-              <w:t>Chưa có lần đo mới riêng với đúng workload TV2</w:t>
+              <w:t>Seek + Lookup so covering Seek; hint, warm cache; IO và XML tách nguồn</w:t>
             </w:r>
           </w:p>
         </w:tc>
@@ -37962,7 +37962,7 @@
               <w:rPr>
                 <w:sz w:val="21"/>
               </w:rPr>
-              <w:t>10.000 dòng; hai plan trả833 dòng</w:t>
+              <w:t>10.000 dòng tạm; 13/10/2026; 833 dòng</w:t>
             </w:r>
           </w:p>
         </w:tc>
@@ -37987,7 +37987,7 @@
               <w:rPr>
                 <w:sz w:val="21"/>
               </w:rPr>
-              <w:t>142 →15</w:t>
+              <w:t>126 →13</w:t>
             </w:r>
           </w:p>
         </w:tc>
@@ -38012,7 +38012,7 @@
               <w:rPr>
                 <w:sz w:val="21"/>
               </w:rPr>
-              <w:t>ActualPlan_4 scan và _5 covering seek</w:t>
+              <w:t>Scan/seek có hint; Results đầy đủ, hash source và cleanup</w:t>
             </w:r>
           </w:p>
         </w:tc>
@@ -38025,12 +38025,12 @@
     </w:p>
     <w:p>
       <w:r>
-        <w:t>Plan TV5 _6 trên NHANVIEN QA có seek 2 reads nhưng 0 dòng thực trả, nên không dùng như số cải thiện workload có kết quả. Số 94 →2 trong báo cáo lịch sử là phép đo khác. Báo cáo giữ rõ mốc và dữ liệu của từng phép so để không ghép số trước ở lần này với số sau ở lần khác.</w:t>
+        <w:t>TV5 ngày 13/10 có đủ Messages, Results, hai actual plans và cleanup trên fixture 10.000 dòng, cùng 833 kết quả, 126 →13 reads. Số 142 →15 ngày 07/10 và 94 →2 cũ thuộc lượt lịch sử khác. Plan _6 trả 0 dòng không dùng làm cải thiện. Các phép đo dùng hint và dữ liệu tạm, không chứng minh tốc độ toàn ứng dụng.</w:t>
       </w:r>
     </w:p>
     <w:p>
       <w:r>
-        <w:t>Plan thật có thể được mở bằng SSMS khi vấn đáp. Chỉ chiếu ảnh đồ họa plan chưa đủ để xác nhận nguồn dữ liệu và phép đo; cần giữ .sqlplan, query, logical reads và kết quả. Index mới cũng tăng chi phí ghi, nên đánh giá không chỉ dựa chiều giảm đọc.</w:t>
+        <w:t>TV2 lượt run_20261013_140800 có bốn plans và CSV đối chiếu toàn bộ 273 dòng chi tiết, 9 dòng tổng hợp. Messages chi tiết CPU/elapsed 15/31 →0/2 ms; XML chi tiết 0/0 →0/0, tổng hợp 1/1 →0/0. Messages thiếu thời gian kết thúc tổng hợp. Chênh 574/522 reads chưa xác định nguyên nhân chi tiết. Fixture 30.000 dòng tạm, hint, warm cache, một lượt; dùng phụ lục v3 và cleanup trong evidence/TV2.</w:t>
       </w:r>
     </w:p>
     <w:p>
@@ -39213,7 +39213,7 @@
               <w:rPr>
                 <w:sz w:val="21"/>
               </w:rPr>
-              <w:t>Có trong repository tại mốc commit của báo cáo</w:t>
+              <w:t>Checkout a7e1096 cùng thay đổi local đã kiểm, chưa commit</w:t>
             </w:r>
           </w:p>
         </w:tc>
@@ -39437,7 +39437,7 @@
               <w:rPr>
                 <w:sz w:val="21"/>
               </w:rPr>
-              <w:t>Cần dựng/kiểm tra bộ slide cuối theo phân bổ nhóm</w:t>
+              <w:t>Deck chung 15 slide, đúng phân công, notes và render PowerPoint đã kiểm</w:t>
             </w:r>
           </w:p>
         </w:tc>
@@ -39493,7 +39493,7 @@
               <w:rPr>
                 <w:sz w:val="21"/>
               </w:rPr>
-              <w:t>Log/plan build cần đóng gói; ảnh mới đã có trong docs</w:t>
+              <w:t>Bản chọn có nguồn/hash trong Bo_nop_Nhom06/evidence, giữ nguyên log lịch sử</w:t>
             </w:r>
           </w:p>
         </w:tc>
@@ -39663,7 +39663,7 @@
     </w:p>
     <w:p>
       <w:r>
-        <w:t>Kết quả hiện có gồm SQL module/E2E, identity thật, concurrency và 20 ca GUI trước sửa cùng ba kiểm tra lại sau sửa. Tổng 224 assertions hồi quy Java hỗ trợ bản sửa email, thẻ role và thông báo login. Luồng GUI tháng 10 đối chiếu SQL cho A730.000đ và B0đ, chốt/chặn nguồn/mở lại và phân biệt phiếu A/B.</w:t>
+        <w:t>Minh chứng gồm SQL module/E2E, identity thật, concurrency, GUI 09/10 và đợt QA riêng bổ sung 13/10. Java offline hiện đạt 257 assertions: GuiQa 88 gồm ca tuổi và điện thoại mới, Security 104, LightTheme 45, LoginChip 20; tách riêng số kiểm SQL/live GUI. Fixture demo 09/10 cho A730.000đ/B0đ; fixture QA bổ sung có số khác, không dùng để thay số demo. Word và deck chung cập nhật theo source/evidence đã kiểm, chưa xác nhận tập dượt chung hoặc máy Windows khác.</w:t>
       </w:r>
     </w:p>
     <w:tbl>
@@ -40019,7 +40019,7 @@
               <w:rPr>
                 <w:sz w:val="21"/>
               </w:rPr>
-              <w:t>Có fixture/log/plan; TV2 số cũ cần đo lại nếu trình bày hiện hành</w:t>
+              <w:t>Có TV2 benchmark mới 13/10; dùng riêng Messages/XML và giới hạn fixture</w:t>
             </w:r>
           </w:p>
         </w:tc>
@@ -40075,7 +40075,7 @@
               <w:rPr>
                 <w:sz w:val="21"/>
               </w:rPr>
-              <w:t>Cần rehearsal, đóng gói evidence và kiểm bộ slide cuối</w:t>
+              <w:t>Cần tập dượt chung và kiểm cài/chạy trên máy nhận</w:t>
             </w:r>
           </w:p>
         </w:tc>
@@ -41235,7 +41235,7 @@
     </w:p>
     <w:p>
       <w:r>
-        <w:t>Repository https://github.com/tranducanhyn99-prog/Project_QuanLyNhanSuTienLuong. Mốc source của báo cáo là commit 0223f2f24156c4f1a7a18d08b2a743d94a6ba302, ngày 10/10/2026. Kết quả kiểm thử giữ nguyên ngày thực thi, không đổi thành ngày lập báo cáo.</w:t>
+        <w:t>Repository: github.com/tranducanhyn99-prog/Project_QuanLyNhanSuTienLuong. Bản 13/10 dùng checkout a7e1096 và sửa local chưa commit. SOURCE_PROVENANCE.csv trong bộ nộp ghi hash file cuối. Evidence TV2 PR44 nhận tại head7efd9dd; kết quả thực thi giữ ngày riêng, không đổi thành ngày lập báo cáo.</w:t>
       </w:r>
     </w:p>
     <w:p>
@@ -41788,7 +41788,7 @@
     </w:p>
     <w:p>
       <w:r>
-        <w:t>Các log và plan trong build được bỏ qua bởi Git. Khi bàn giao bộ nộp, nhóm cần đóng gói đúng các file này cùng source và script để giảng viên có thể đối chiếu phép đo. Ảnh cũ hoặc hình mô phỏng không thay thế execution plan hay kết quả chạy thực tế.</w:t>
+        <w:t>Các đường build trong bảng trên chỉ nguồn lịch sử. Bản đã chọn nằm trong Bo_nop_Nhom06/evidence: TV5/verification-20261013, sql-regression-20261013 và QA bổ sung; TV2/README_TV5_RECEIPT.md dẫn raw run_20261013_140800 và phụ lục v3. README_EVIDENCE, SOURCE_PROVENANCE và manifest SHA-256 xác định file cuối. Ảnh render, PASS SQL và thao tác GUI được ghi riêng, không thay thế nhau.</w:t>
       </w:r>
     </w:p>
     <w:p>

</xml_diff>

<commit_message>
docs(tv5): reconcile TV2 final handoff status
</commit_message>
<xml_diff>
--- a/Bo_nop_Nhom06/report/Nhom_06_Bao_Cao_Cuoi_Ky_DBMS330284.docx
+++ b/Bo_nop_Nhom06/report/Nhom_06_Bao_Cao_Cuoi_Ky_DBMS330284.docx
@@ -658,7 +658,7 @@
     </w:p>
     <w:p>
       <w:r>
-        <w:t>Bản cập nhật ngày 13/10/2026 đối chiếu checkout a7e1096 cùng các sửa local tiền, tuổi và validation đã kiểm; chưa commit. Đã nhận riêng evidence TV2 từ PR44 head7efd9dd, không nhận PR đã merge. Kết quả giữ đúng ngày, môi trường và fixture từng lượt; không suy rộng hiệu năng toàn ứng dụng.</w:t>
+        <w:t>Bản cập nhật ngày 14/10/2026 đối chiếu source đã merge qua PR #45 và evidence TV2 từ PR #44. Benchmark TV2 trong §8.5 và §9.3 dùng lượt đo 13/10 theo bản v3. Kết quả giữ đúng ngày, môi trường và fixture từng lượt; không suy rộng hiệu năng toàn ứng dụng.</w:t>
       </w:r>
     </w:p>
     <w:tbl>
@@ -39213,7 +39213,7 @@
               <w:rPr>
                 <w:sz w:val="21"/>
               </w:rPr>
-              <w:t>Checkout a7e1096 cùng thay đổi local đã kiểm, chưa commit</w:t>
+              <w:t>Source Java/SQL đã merge qua PR #45; snapshot và hash trong bộ nộp</w:t>
             </w:r>
           </w:p>
         </w:tc>
@@ -41235,7 +41235,7 @@
     </w:p>
     <w:p>
       <w:r>
-        <w:t>Repository: github.com/tranducanhyn99-prog/Project_QuanLyNhanSuTienLuong. Bản 13/10 dùng checkout a7e1096 và sửa local chưa commit. SOURCE_PROVENANCE.csv trong bộ nộp ghi hash file cuối. Evidence TV2 PR44 nhận tại head7efd9dd; kết quả thực thi giữ ngày riêng, không đổi thành ngày lập báo cáo.</w:t>
+        <w:t>Repository: github.com/tranducanhyn99-prog/Project_QuanLyNhanSuTienLuong. Bản TV5 đã merge qua PR #45; evidence TV2 nhận từ PR #44 và hướng dẫn v3 được hiệu đính tại PR #46. SOURCE_PROVENANCE.csv ghi hash file nguồn; ngày chạy trong minh chứng không đổi thành ngày lập báo cáo.</w:t>
       </w:r>
     </w:p>
     <w:p>

</xml_diff>

<commit_message>
docs(tv5): integrate TV3 handoff and verify submission package
</commit_message>
<xml_diff>
--- a/Bo_nop_Nhom06/report/Nhom_06_Bao_Cao_Cuoi_Ky_DBMS330284.docx
+++ b/Bo_nop_Nhom06/report/Nhom_06_Bao_Cao_Cuoi_Ky_DBMS330284.docx
@@ -658,7 +658,7 @@
     </w:p>
     <w:p>
       <w:r>
-        <w:t>Bản cập nhật ngày 14/10/2026 đối chiếu source đã merge qua PR #45 và evidence TV2 từ PR #44. Benchmark TV2 trong §8.5 và §9.3 dùng lượt đo 13/10 theo bản v3. Kết quả giữ đúng ngày, môi trường và fixture từng lượt; không suy rộng hiệu năng toàn ứng dụng.</w:t>
+        <w:t>Bản cập nhật 15/10/2026 đã nhận TV3 qua PR #43 và hiệu đính PR #48. Benchmark TV2 trong §8.5/§9.3 dùng lượt 13/10 theo v3; TV3 dùng log/plan bàn giao ngày 13/10. Kết quả giữ đúng nguồn, môi trường và fixture; không suy rộng hiệu năng toàn ứng dụng.</w:t>
       </w:r>
     </w:p>
     <w:tbl>
@@ -35780,7 +35780,7 @@
               <w:rPr>
                 <w:sz w:val="21"/>
               </w:rPr>
-              <w:t>PASS các assert</w:t>
+              <w:t>4 thông báo PASS; 13/10</w:t>
             </w:r>
           </w:p>
         </w:tc>
@@ -35805,7 +35805,7 @@
               <w:rPr>
                 <w:sz w:val="21"/>
               </w:rPr>
-              <w:t>Tổng/empty, constraint, xóa nháp, chặn chốt</w:t>
+              <w:t>Hàm/view, CHECK, xóa header; không test riêng trigger/SP OUTPUT</w:t>
             </w:r>
           </w:p>
         </w:tc>
@@ -37644,7 +37644,7 @@
               <w:rPr>
                 <w:sz w:val="21"/>
               </w:rPr>
-              <w:t>30.000 dòng; target 7 dòng, tổng 6.300.000</w:t>
+              <w:t>30.000 dòng tạm; 13/10; 7 dòng nguồn, gom 1 dòng</w:t>
             </w:r>
           </w:p>
         </w:tc>
@@ -37694,7 +37694,7 @@
               <w:rPr>
                 <w:sz w:val="21"/>
               </w:rPr>
-              <w:t>Bảng tạm, cùng kết quả</w:t>
+              <w:t>Fixture riêng; Messages/plan tách nguồn</w:t>
             </w:r>
           </w:p>
         </w:tc>
@@ -38042,7 +38042,7 @@
           <w:i/>
           <w:sz w:val="18"/>
         </w:rPr>
-        <w:t>Đối chiếu [8], technical evidence và .sqlplan trong phụ lục</w:t>
+        <w:t>TV3 ngày 13/10: Messages CPU 0/0 ms, elapsed 37/27 ms; XML 4/0 ms là nguồn đo khác. Xem evidence/TV3/README_EVIDENCE.md; log chưa xác nhận commit SQL đã chạy.</w:t>
       </w:r>
     </w:p>
     <w:p>
@@ -39437,7 +39437,7 @@
               <w:rPr>
                 <w:sz w:val="21"/>
               </w:rPr>
-              <w:t>Deck chung 15 slide, đúng phân công, notes và render PowerPoint đã kiểm</w:t>
+              <w:t>Deck 15 slide; TV2/TV3/TV4 đã nhận, notes và render được kiểm; TV1 chờ xác nhận</w:t>
             </w:r>
           </w:p>
         </w:tc>
@@ -39493,7 +39493,7 @@
               <w:rPr>
                 <w:sz w:val="21"/>
               </w:rPr>
-              <w:t>Bản chọn có nguồn/hash trong Bo_nop_Nhom06/evidence, giữ nguyên log lịch sử</w:t>
+              <w:t>Đã nhận TV2/TV3/TV4/TV5; TV1 còn chờ. Nguồn/hash trong Bo_nop_Nhom06/evidence</w:t>
             </w:r>
           </w:p>
         </w:tc>
@@ -41235,7 +41235,7 @@
     </w:p>
     <w:p>
       <w:r>
-        <w:t>Repository: github.com/tranducanhyn99-prog/Project_QuanLyNhanSuTienLuong. Bản TV5 đã merge qua PR #45; evidence TV2 nhận từ PR #44 và hướng dẫn v3 được hiệu đính tại PR #46. SOURCE_PROVENANCE.csv ghi hash file nguồn; ngày chạy trong minh chứng không đổi thành ngày lập báo cáo.</w:t>
+        <w:t>Repository: github.com/tranducanhyn99-prog/Project_QuanLyNhanSuTienLuong. TV3 nhận qua PR #43, hiệu đính PR #48; TV2 qua PR #44/#46, source TV5 qua PR #45. Provenance ghi hash bản bàn giao, không tự xác nhận commit SQL của lượt chạy.</w:t>
       </w:r>
     </w:p>
     <w:p>
@@ -41788,7 +41788,7 @@
     </w:p>
     <w:p>
       <w:r>
-        <w:t>Các đường build trong bảng trên chỉ nguồn lịch sử. Bản đã chọn nằm trong Bo_nop_Nhom06/evidence: TV5/verification-20261013, sql-regression-20261013 và QA bổ sung; TV2/README_TV5_RECEIPT.md dẫn raw run_20261013_140800 và phụ lục v3. README_EVIDENCE, SOURCE_PROVENANCE và manifest SHA-256 xác định file cuối. Ảnh render, PASS SQL và thao tác GUI được ghi riêng, không thay thế nhau.</w:t>
+        <w:t>Các đường build trong bảng là nguồn lịch sử. Bản chọn nằm trong Bo_nop_Nhom06/evidence: TV5/verification-20261013 và QA bổ sung; TV2/README_TV5_RECEIPT.md dẫn v3; TV3/README_EVIDENCE.md dẫn log/plan 13/10 và ảnh lịch sử. Inventory/manifest SHA-256 xác định file cuối; ảnh render, PASS SQL và thao tác GUI không thay thế nhau.</w:t>
       </w:r>
     </w:p>
     <w:p>

</xml_diff>

<commit_message>
docs(package): dong bo word/slide, bo sung evidence option b tv2 va cap nhat manifest
</commit_message>
<xml_diff>
--- a/Bo_nop_Nhom06/report/Nhom_06_Bao_Cao_Cuoi_Ky_DBMS330284.docx
+++ b/Bo_nop_Nhom06/report/Nhom_06_Bao_Cao_Cuoi_Ky_DBMS330284.docx
@@ -12805,7 +12805,7 @@
         <w:keepNext/>
       </w:pPr>
       <w:r>
-        <w:t>SP ghi chấm công không có TRY…CATCH riêng; transaction nhập lô nằm ở JDBC caller. Báo cáo ghi đúng sự khác biệt này khi đối chiếu yêu cầu SP có xử lý lỗi. Các SP có transaction ở SQL được trình bày theo phạm vi commit, rollback và savepoint thực tế, không áp một khuôn chung cho mọi SP.</w:t>
+        <w:t>sp_GhiNhanChamCong dùng TRY...CATCH quanh kiểm tra, INSERT và gán SCOPE_IDENTITY; bare THROW giữ nguyên lỗi. Thủ tục không mở transaction riêng; ChamCongService quản lý transaction JDBC cho cả lô. QA Option B ngày 16/10/2026: SQL 21/21, JDBC 105 assertions, controlled suite 179/179 và concurrency 4/4. Đây là kiểm SQL/JDBC, chưa thay rehearsal GUI.</w:t>
       </w:r>
     </w:p>
     <w:p>
@@ -28260,7 +28260,7 @@
     </w:p>
     <w:p>
       <w:r>
-        <w:t>SP này không có BEGIN TRY…CATCH hoặc transaction riêng. Khi nhập lô, ChamCongService mở transaction JDBC, truyền cùng Connection cho DAO và xử lý commit/rollback. Lỗi SQL từ SP hoặc trigger được caller nhận. Vì vậy không mô tả năm SP lõi như cùng một cấu trúc transaction SQL.</w:t>
+        <w:t>sp_GhiNhanChamCong bắt lỗi bằng TRY...CATCH; bare THROW giữ nguyên lỗi SQL. Thủ tục không mở transaction. ChamCongService truyền cùng connection và rollback toàn lô khi một dòng lỗi. QA Option B ngày 16/10/2026 đạt SQL 21/21, JDBC 105 assertions, controlled suite 179/179 và concurrency 4/4. Log: evidence/TV2/optionb-20261016/.</w:t>
       </w:r>
     </w:p>
     <w:p>

</xml_diff>